<commit_message>
Add Townsend-team spatial aggregation script as last saved (2024-11-14)
Henry Frye's BioSCapeRawSpatialAgg.R and processing notes, copied unchanged
from his local clone, where they were never committed. This version adds the
Townsend plot-quality flags, location flags and opportunistic-plot links used
in the v20241114 spatial data. Committed as-is for provenance; it does not
quite reproduce the v20241114 output (see the next commit).

Co-Authored-By: Claude Opus 5.5 <noreply@anthropic.com>
</commit_message>
<xml_diff>
--- a/BotanistSpatialDataNotes.docx
+++ b/BotanistSpatialDataNotes.docx
@@ -390,7 +390,23 @@
           <w:rFonts w:ascii="Arial" w:hAnsi="Arial" w:cs="Arial"/>
           <w:color w:val="000000" w:themeColor="text1"/>
         </w:rPr>
-        <w:t xml:space="preserve">Has duplicated data from the previous two, but has data from De Hoop, Boland Mountains and Groot </w:t>
+        <w:t xml:space="preserve">Has duplicated data from the previous two, but has data from De Hoop, Boland </w:t>
+      </w:r>
+      <w:proofErr w:type="gramStart"/>
+      <w:r>
+        <w:rPr>
+          <w:rFonts w:ascii="Arial" w:hAnsi="Arial" w:cs="Arial"/>
+          <w:color w:val="000000" w:themeColor="text1"/>
+        </w:rPr>
+        <w:t>Mountains</w:t>
+      </w:r>
+      <w:proofErr w:type="gramEnd"/>
+      <w:r>
+        <w:rPr>
+          <w:rFonts w:ascii="Arial" w:hAnsi="Arial" w:cs="Arial"/>
+          <w:color w:val="000000" w:themeColor="text1"/>
+        </w:rPr>
+        <w:t xml:space="preserve"> and Groot </w:t>
       </w:r>
       <w:proofErr w:type="spellStart"/>
       <w:r>
@@ -399,32 +415,6 @@
           <w:color w:val="000000" w:themeColor="text1"/>
         </w:rPr>
         <w:t>Winterhoek</w:t>
-      </w:r>
-      <w:proofErr w:type="spellEnd"/>
-    </w:p>
-    <w:p>
-      <w:pPr>
-        <w:rPr>
-          <w:rFonts w:ascii="Arial" w:hAnsi="Arial" w:cs="Arial"/>
-          <w:color w:val="000000" w:themeColor="text1"/>
-        </w:rPr>
-      </w:pPr>
-    </w:p>
-    <w:p>
-      <w:pPr>
-        <w:pStyle w:val="Heading2"/>
-        <w:rPr>
-          <w:rFonts w:ascii="Arial" w:hAnsi="Arial" w:cs="Arial"/>
-          <w:color w:val="000000" w:themeColor="text1"/>
-        </w:rPr>
-      </w:pPr>
-      <w:proofErr w:type="spellStart"/>
-      <w:r>
-        <w:rPr>
-          <w:rFonts w:ascii="Arial" w:hAnsi="Arial" w:cs="Arial"/>
-          <w:color w:val="000000" w:themeColor="text1"/>
-        </w:rPr>
-        <w:t>Peninsula_BioscapeiPad</w:t>
       </w:r>
       <w:proofErr w:type="spellEnd"/>
     </w:p>
@@ -445,7 +435,23 @@
           <w:rFonts w:ascii="Arial" w:hAnsi="Arial" w:cs="Arial"/>
           <w:color w:val="000000" w:themeColor="text1"/>
         </w:rPr>
-        <w:t xml:space="preserve">Blue polygon layer looks </w:t>
+        <w:t xml:space="preserve">Updates on Oct 17: added plots from </w:t>
+      </w:r>
+      <w:proofErr w:type="spellStart"/>
+      <w:r>
+        <w:rPr>
+          <w:rFonts w:ascii="Arial" w:hAnsi="Arial" w:cs="Arial"/>
+          <w:color w:val="000000" w:themeColor="text1"/>
+        </w:rPr>
+        <w:t>Rooiberg</w:t>
+      </w:r>
+      <w:proofErr w:type="spellEnd"/>
+      <w:r>
+        <w:rPr>
+          <w:rFonts w:ascii="Arial" w:hAnsi="Arial" w:cs="Arial"/>
+          <w:color w:val="000000" w:themeColor="text1"/>
+        </w:rPr>
+        <w:t xml:space="preserve"> </w:t>
       </w:r>
       <w:proofErr w:type="gramStart"/>
       <w:r>
@@ -453,9 +459,35 @@
           <w:rFonts w:ascii="Arial" w:hAnsi="Arial" w:cs="Arial"/>
           <w:color w:val="000000" w:themeColor="text1"/>
         </w:rPr>
-        <w:t>empty</w:t>
+        <w:t>area</w:t>
       </w:r>
       <w:proofErr w:type="gramEnd"/>
+    </w:p>
+    <w:p>
+      <w:pPr>
+        <w:rPr>
+          <w:rFonts w:ascii="Arial" w:hAnsi="Arial" w:cs="Arial"/>
+          <w:color w:val="000000" w:themeColor="text1"/>
+        </w:rPr>
+      </w:pPr>
+    </w:p>
+    <w:p>
+      <w:pPr>
+        <w:pStyle w:val="Heading2"/>
+        <w:rPr>
+          <w:rFonts w:ascii="Arial" w:hAnsi="Arial" w:cs="Arial"/>
+          <w:color w:val="000000" w:themeColor="text1"/>
+        </w:rPr>
+      </w:pPr>
+      <w:proofErr w:type="spellStart"/>
+      <w:r>
+        <w:rPr>
+          <w:rFonts w:ascii="Arial" w:hAnsi="Arial" w:cs="Arial"/>
+          <w:color w:val="000000" w:themeColor="text1"/>
+        </w:rPr>
+        <w:t>Peninsula_BioscapeiPad</w:t>
+      </w:r>
+      <w:proofErr w:type="spellEnd"/>
     </w:p>
     <w:p>
       <w:pPr>
@@ -474,8 +506,17 @@
           <w:rFonts w:ascii="Arial" w:hAnsi="Arial" w:cs="Arial"/>
           <w:color w:val="000000" w:themeColor="text1"/>
         </w:rPr>
-        <w:t>Green points parking</w:t>
-      </w:r>
+        <w:t xml:space="preserve">Blue polygon layer looks </w:t>
+      </w:r>
+      <w:proofErr w:type="gramStart"/>
+      <w:r>
+        <w:rPr>
+          <w:rFonts w:ascii="Arial" w:hAnsi="Arial" w:cs="Arial"/>
+          <w:color w:val="000000" w:themeColor="text1"/>
+        </w:rPr>
+        <w:t>empty</w:t>
+      </w:r>
+      <w:proofErr w:type="gramEnd"/>
     </w:p>
     <w:p>
       <w:pPr>
@@ -494,7 +535,7 @@
           <w:rFonts w:ascii="Arial" w:hAnsi="Arial" w:cs="Arial"/>
           <w:color w:val="000000" w:themeColor="text1"/>
         </w:rPr>
-        <w:t>Red points true sites</w:t>
+        <w:t>Green points parking</w:t>
       </w:r>
     </w:p>
     <w:p>
@@ -514,23 +555,7 @@
           <w:rFonts w:ascii="Arial" w:hAnsi="Arial" w:cs="Arial"/>
           <w:color w:val="000000" w:themeColor="text1"/>
         </w:rPr>
-        <w:t xml:space="preserve">Yellow polygons are the </w:t>
-      </w:r>
-      <w:proofErr w:type="gramStart"/>
-      <w:r>
-        <w:rPr>
-          <w:rFonts w:ascii="Arial" w:hAnsi="Arial" w:cs="Arial"/>
-          <w:color w:val="000000" w:themeColor="text1"/>
-        </w:rPr>
-        <w:t>actually</w:t>
-      </w:r>
-      <w:proofErr w:type="gramEnd"/>
-      <w:r>
-        <w:rPr>
-          <w:rFonts w:ascii="Arial" w:hAnsi="Arial" w:cs="Arial"/>
-          <w:color w:val="000000" w:themeColor="text1"/>
-        </w:rPr>
-        <w:t xml:space="preserve"> polygons.</w:t>
+        <w:t>Red points true sites</w:t>
       </w:r>
     </w:p>
     <w:p>
@@ -550,6 +575,42 @@
           <w:rFonts w:ascii="Arial" w:hAnsi="Arial" w:cs="Arial"/>
           <w:color w:val="000000" w:themeColor="text1"/>
         </w:rPr>
+        <w:t xml:space="preserve">Yellow polygons are the </w:t>
+      </w:r>
+      <w:proofErr w:type="gramStart"/>
+      <w:r>
+        <w:rPr>
+          <w:rFonts w:ascii="Arial" w:hAnsi="Arial" w:cs="Arial"/>
+          <w:color w:val="000000" w:themeColor="text1"/>
+        </w:rPr>
+        <w:t>actually</w:t>
+      </w:r>
+      <w:proofErr w:type="gramEnd"/>
+      <w:r>
+        <w:rPr>
+          <w:rFonts w:ascii="Arial" w:hAnsi="Arial" w:cs="Arial"/>
+          <w:color w:val="000000" w:themeColor="text1"/>
+        </w:rPr>
+        <w:t xml:space="preserve"> polygons.</w:t>
+      </w:r>
+    </w:p>
+    <w:p>
+      <w:pPr>
+        <w:pStyle w:val="ListParagraph"/>
+        <w:numPr>
+          <w:ilvl w:val="0"/>
+          <w:numId w:val="2"/>
+        </w:numPr>
+        <w:rPr>
+          <w:rFonts w:ascii="Arial" w:hAnsi="Arial" w:cs="Arial"/>
+          <w:color w:val="000000" w:themeColor="text1"/>
+        </w:rPr>
+      </w:pPr>
+      <w:r>
+        <w:rPr>
+          <w:rFonts w:ascii="Arial" w:hAnsi="Arial" w:cs="Arial"/>
+          <w:color w:val="000000" w:themeColor="text1"/>
+        </w:rPr>
         <w:t xml:space="preserve">Note that the Peninsula Sites 2023 zip file is a </w:t>
       </w:r>
       <w:proofErr w:type="gramStart"/>
@@ -642,8 +703,17 @@
           <w:rFonts w:ascii="Arial" w:hAnsi="Arial" w:cs="Arial"/>
           <w:color w:val="000000" w:themeColor="text1"/>
         </w:rPr>
-        <w:t xml:space="preserve"> and Hottentot mountains</w:t>
-      </w:r>
+        <w:t xml:space="preserve"> and Hottentot </w:t>
+      </w:r>
+      <w:proofErr w:type="gramStart"/>
+      <w:r>
+        <w:rPr>
+          <w:rFonts w:ascii="Arial" w:hAnsi="Arial" w:cs="Arial"/>
+          <w:color w:val="000000" w:themeColor="text1"/>
+        </w:rPr>
+        <w:t>mountains</w:t>
+      </w:r>
+      <w:proofErr w:type="gramEnd"/>
     </w:p>
     <w:p>
       <w:pPr>
@@ -702,6 +772,58 @@
         <w:t xml:space="preserve"> (Agulhas).</w:t>
       </w:r>
     </w:p>
+    <w:p>
+      <w:r>
+        <w:t>BioSCape03</w:t>
+      </w:r>
+    </w:p>
+    <w:p>
+      <w:pPr>
+        <w:pStyle w:val="ListParagraph"/>
+        <w:numPr>
+          <w:ilvl w:val="0"/>
+          <w:numId w:val="3"/>
+        </w:numPr>
+      </w:pPr>
+      <w:r>
+        <w:t xml:space="preserve">Updated October 17. Includes remaining west coast, </w:t>
+      </w:r>
+      <w:proofErr w:type="spellStart"/>
+      <w:r>
+        <w:t>agulhas</w:t>
+      </w:r>
+      <w:proofErr w:type="spellEnd"/>
+      <w:r>
+        <w:t xml:space="preserve">, garden routes and a couple sites out by Paarl. Note that red point file contains a southern </w:t>
+      </w:r>
+      <w:proofErr w:type="spellStart"/>
+      <w:r>
+        <w:t>Rocherpan</w:t>
+      </w:r>
+      <w:proofErr w:type="spellEnd"/>
+      <w:r>
+        <w:t xml:space="preserve"> site </w:t>
+      </w:r>
+      <w:r>
+        <w:lastRenderedPageBreak/>
+        <w:t>that looks shifted from the planned center as if the botanist moved it. However, the polygon is drawn over the planned center and I’m treating that as the true center unless I f</w:t>
+      </w:r>
+      <w:r>
+        <w:t>in</w:t>
+      </w:r>
+      <w:r>
+        <w:t>d differing evidence.</w:t>
+      </w:r>
+    </w:p>
+    <w:p>
+      <w:pPr>
+        <w:pStyle w:val="ListParagraph"/>
+        <w:numPr>
+          <w:ilvl w:val="0"/>
+          <w:numId w:val="3"/>
+        </w:numPr>
+      </w:pPr>
+    </w:p>
     <w:p/>
     <w:p>
       <w:pPr>
@@ -734,6 +856,88 @@
         </w:rPr>
         <w:t xml:space="preserve"> Log</w:t>
       </w:r>
+    </w:p>
+    <w:p>
+      <w:pPr>
+        <w:rPr>
+          <w:rFonts w:ascii="Arial" w:hAnsi="Arial" w:cs="Arial"/>
+          <w:color w:val="000000" w:themeColor="text1"/>
+        </w:rPr>
+      </w:pPr>
+      <w:r>
+        <w:rPr>
+          <w:rFonts w:ascii="Arial" w:hAnsi="Arial" w:cs="Arial"/>
+          <w:color w:val="000000" w:themeColor="text1"/>
+        </w:rPr>
+        <w:t xml:space="preserve">From the </w:t>
+      </w:r>
+      <w:proofErr w:type="spellStart"/>
+      <w:r>
+        <w:rPr>
+          <w:rFonts w:ascii="Arial" w:hAnsi="Arial" w:cs="Arial"/>
+          <w:color w:val="000000" w:themeColor="text1"/>
+        </w:rPr>
+        <w:t>Peninsula_BioscapeiPad</w:t>
+      </w:r>
+      <w:proofErr w:type="spellEnd"/>
+      <w:r>
+        <w:rPr>
+          <w:rFonts w:ascii="Arial" w:hAnsi="Arial" w:cs="Arial"/>
+          <w:color w:val="000000" w:themeColor="text1"/>
+        </w:rPr>
+        <w:t xml:space="preserve"> folder:  </w:t>
+      </w:r>
+      <w:r>
+        <w:rPr>
+          <w:rFonts w:ascii="Arial" w:hAnsi="Arial" w:cs="Arial"/>
+          <w:color w:val="000000" w:themeColor="text1"/>
+        </w:rPr>
+        <w:t>Plot T89 was not included in the main Peninsula</w:t>
+      </w:r>
+      <w:r>
+        <w:rPr>
+          <w:rFonts w:ascii="Arial" w:hAnsi="Arial" w:cs="Arial"/>
+          <w:color w:val="000000" w:themeColor="text1"/>
+        </w:rPr>
+        <w:t xml:space="preserve"> plot center points</w:t>
+      </w:r>
+      <w:r>
+        <w:rPr>
+          <w:rFonts w:ascii="Arial" w:hAnsi="Arial" w:cs="Arial"/>
+          <w:color w:val="000000" w:themeColor="text1"/>
+        </w:rPr>
+        <w:t xml:space="preserve"> but did have a polygon. </w:t>
+      </w:r>
+      <w:r>
+        <w:rPr>
+          <w:rFonts w:ascii="Arial" w:hAnsi="Arial" w:cs="Arial"/>
+          <w:color w:val="000000" w:themeColor="text1"/>
+        </w:rPr>
+        <w:t>I’m not sure what the observation layer is</w:t>
+      </w:r>
+      <w:r>
+        <w:rPr>
+          <w:rFonts w:ascii="Arial" w:hAnsi="Arial" w:cs="Arial"/>
+          <w:color w:val="000000" w:themeColor="text1"/>
+        </w:rPr>
+        <w:t xml:space="preserve"> within the folder (probably original site locations?)</w:t>
+      </w:r>
+    </w:p>
+    <w:p>
+      <w:pPr>
+        <w:rPr>
+          <w:rFonts w:ascii="Arial" w:hAnsi="Arial" w:cs="Arial"/>
+          <w:color w:val="000000" w:themeColor="text1"/>
+        </w:rPr>
+      </w:pPr>
+    </w:p>
+    <w:p>
+      <w:pPr>
+        <w:rPr>
+          <w:rFonts w:ascii="Arial" w:hAnsi="Arial" w:cs="Arial"/>
+          <w:color w:val="000000" w:themeColor="text1"/>
+        </w:rPr>
+      </w:pPr>
     </w:p>
     <w:p>
       <w:pPr>
@@ -749,58 +953,7 @@
           <w:rFonts w:ascii="Arial" w:hAnsi="Arial" w:cs="Arial"/>
           <w:color w:val="000000" w:themeColor="text1"/>
         </w:rPr>
-        <w:t xml:space="preserve">From the </w:t>
-      </w:r>
-      <w:proofErr w:type="spellStart"/>
-      <w:r>
-        <w:rPr>
-          <w:rFonts w:ascii="Arial" w:hAnsi="Arial" w:cs="Arial"/>
-          <w:color w:val="000000" w:themeColor="text1"/>
-        </w:rPr>
-        <w:t>Peninsula_BioscapeiPad</w:t>
-      </w:r>
-      <w:proofErr w:type="spellEnd"/>
-      <w:r>
-        <w:rPr>
-          <w:rFonts w:ascii="Arial" w:hAnsi="Arial" w:cs="Arial"/>
-          <w:color w:val="000000" w:themeColor="text1"/>
-        </w:rPr>
-        <w:t xml:space="preserve"> folder:  </w:t>
-      </w:r>
-      <w:r>
-        <w:rPr>
-          <w:rFonts w:ascii="Arial" w:hAnsi="Arial" w:cs="Arial"/>
-          <w:color w:val="000000" w:themeColor="text1"/>
-        </w:rPr>
-        <w:t>Plot T89 was not included in the main Peninsula</w:t>
-      </w:r>
-      <w:r>
-        <w:rPr>
-          <w:rFonts w:ascii="Arial" w:hAnsi="Arial" w:cs="Arial"/>
-          <w:color w:val="000000" w:themeColor="text1"/>
-        </w:rPr>
-        <w:t xml:space="preserve"> plot center points</w:t>
-      </w:r>
-      <w:r>
-        <w:rPr>
-          <w:rFonts w:ascii="Arial" w:hAnsi="Arial" w:cs="Arial"/>
-          <w:color w:val="000000" w:themeColor="text1"/>
-        </w:rPr>
-        <w:t xml:space="preserve"> but did have a polygon. </w:t>
-      </w:r>
-      <w:r>
-        <w:rPr>
-          <w:rFonts w:ascii="Arial" w:hAnsi="Arial" w:cs="Arial"/>
-          <w:color w:val="000000" w:themeColor="text1"/>
-        </w:rPr>
-        <w:t>I’m not sure what the observation layer is</w:t>
-      </w:r>
-      <w:r>
-        <w:rPr>
-          <w:rFonts w:ascii="Arial" w:hAnsi="Arial" w:cs="Arial"/>
-          <w:color w:val="000000" w:themeColor="text1"/>
-        </w:rPr>
-        <w:t xml:space="preserve"> within the folder (probably original site locations?)</w:t>
+        <w:t>T059 missing polygon from raw data.</w:t>
       </w:r>
     </w:p>
     <w:sectPr>
@@ -931,7 +1084,7 @@
   <w:abstractNum w:abstractNumId="1" w15:restartNumberingAfterBreak="0">
     <w:nsid w:val="212F3DF0"/>
     <w:multiLevelType w:val="hybridMultilevel"/>
-    <w:tmpl w:val="32E85822"/>
+    <w:tmpl w:val="995CF892"/>
     <w:lvl w:ilvl="0" w:tplc="04090001">
       <w:start w:val="1"/>
       <w:numFmt w:val="bullet"/>

</xml_diff>